<commit_message>
Knowledge - 3-Work knowledge - 1/22/2026 - part 6
</commit_message>
<xml_diff>
--- a/Knowledge/3-Work knowledge/1-Software Engineering/1-Software Engineering Fundamentals/5-My Source/1-Network Traffic/1-Types of Network Traffic/1-Types of Network Traffic.docx
+++ b/Knowledge/3-Work knowledge/1-Software Engineering/1-Software Engineering Fundamentals/5-My Source/1-Network Traffic/1-Types of Network Traffic/1-Types of Network Traffic.docx
@@ -18,7 +18,7 @@
       </w:pPr>
       <w:r>
         <w:rPr>
-          <w:rFonts w:ascii="Arial" w:hAnsi="Arial" w:eastAsia="Arial"/>
+          <w:rFonts w:ascii="Arial" w:eastAsia="Arial" w:hAnsi="Arial"/>
           <w:b/>
           <w:sz w:val="22"/>
           <w:shd w:val="clear" w:color="auto" w:fill="B7B7B7"/>
@@ -27,35 +27,24 @@
       </w:r>
       <w:r>
         <w:rPr>
-          <w:rFonts w:ascii="Arial" w:hAnsi="Arial" w:eastAsia="Arial"/>
+          <w:rFonts w:ascii="Arial" w:eastAsia="Arial" w:hAnsi="Arial"/>
           <w:sz w:val="22"/>
           <w:shd w:val="clear" w:color="auto" w:fill="B7B7B7"/>
         </w:rPr>
         <w:t xml:space="preserve">: </w:t>
       </w:r>
-      <w:proofErr w:type="spellStart"/>
       <w:r>
         <w:rPr>
-          <w:rFonts w:ascii="Arial" w:hAnsi="Arial" w:eastAsia="Arial"/>
+          <w:rFonts w:ascii="Arial" w:eastAsia="Arial" w:hAnsi="Arial"/>
           <w:b/>
           <w:sz w:val="22"/>
           <w:shd w:val="clear" w:color="auto" w:fill="B7B7B7"/>
         </w:rPr>
-        <w:t>Chatgpt</w:t>
-      </w:r>
-      <w:proofErr w:type="spellEnd"/>
-      <w:r>
-        <w:rPr>
-          <w:rFonts w:ascii="Arial" w:hAnsi="Arial" w:eastAsia="Arial"/>
-          <w:b/>
-          <w:sz w:val="22"/>
-          <w:shd w:val="clear" w:color="auto" w:fill="B7B7B7"/>
-        </w:rPr>
-        <w:t xml:space="preserve"> </w:t>
+        <w:t xml:space="preserve">Chatgpt </w:t>
       </w:r>
       <w:r>
         <w:rPr>
-          <w:rFonts w:ascii="Arial" w:hAnsi="Arial" w:eastAsia="Arial"/>
+          <w:rFonts w:ascii="Arial" w:eastAsia="Arial" w:hAnsi="Arial"/>
           <w:b/>
           <w:sz w:val="22"/>
           <w:szCs w:val="14"/>
@@ -65,7 +54,7 @@
       </w:r>
       <w:r>
         <w:rPr>
-          <w:rFonts w:ascii="Arial" w:hAnsi="Arial" w:cs="Cambria Math" w:eastAsia="Arial"/>
+          <w:rFonts w:ascii="Arial" w:eastAsia="Arial" w:hAnsi="Arial" w:cs="Cambria Math"/>
           <w:b/>
           <w:sz w:val="22"/>
           <w:szCs w:val="14"/>
@@ -75,7 +64,7 @@
       </w:r>
       <w:r>
         <w:rPr>
-          <w:rFonts w:ascii="Arial" w:hAnsi="Arial" w:eastAsia="Arial"/>
+          <w:rFonts w:ascii="Arial" w:eastAsia="Arial" w:hAnsi="Arial"/>
           <w:b/>
           <w:sz w:val="22"/>
           <w:szCs w:val="14"/>
@@ -95,7 +84,7 @@
           <w:noProof/>
         </w:rPr>
         <w:drawing>
-          <wp:inline distT="0" distB="0" distL="0" distR="0" wp14:anchorId="7BC2F569" wp14:editId="579E275B">
+          <wp:inline distT="0" distB="0" distL="0" distR="0" wp14:anchorId="7F5D6DDA" wp14:editId="3E4C3064">
             <wp:extent cx="5943600" cy="3692525"/>
             <wp:effectExtent l="0" t="0" r="0" b="3175"/>
             <wp:docPr id="366356093" name="Picture 1"/>
@@ -687,6 +676,7 @@
         </w:tc>
       </w:tr>
     </w:tbl>
+    <w:p/>
     <w:p/>
     <w:sectPr>
       <w:pgSz w:w="12240" w:h="15840"/>
@@ -1098,7 +1088,7 @@
   <w:style w:type="paragraph" w:default="1" w:styleId="Normal">
     <w:name w:val="Normal"/>
     <w:qFormat/>
-    <w:rsid w:val="00143D4D"/>
+    <w:rsid w:val="00A478BA"/>
   </w:style>
   <w:style w:type="paragraph" w:styleId="Heading1">
     <w:name w:val="heading 1"/>
@@ -1107,7 +1097,7 @@
     <w:link w:val="Heading1Char"/>
     <w:uiPriority w:val="9"/>
     <w:qFormat/>
-    <w:rsid w:val="009D2541"/>
+    <w:rsid w:val="00A478BA"/>
     <w:pPr>
       <w:keepNext/>
       <w:keepLines/>
@@ -1129,7 +1119,7 @@
     <w:uiPriority w:val="9"/>
     <w:unhideWhenUsed/>
     <w:qFormat/>
-    <w:rsid w:val="009D2541"/>
+    <w:rsid w:val="00A478BA"/>
     <w:pPr>
       <w:keepNext/>
       <w:keepLines/>
@@ -1152,7 +1142,7 @@
     <w:semiHidden/>
     <w:unhideWhenUsed/>
     <w:qFormat/>
-    <w:rsid w:val="009D2541"/>
+    <w:rsid w:val="00A478BA"/>
     <w:pPr>
       <w:keepNext/>
       <w:keepLines/>
@@ -1175,7 +1165,7 @@
     <w:semiHidden/>
     <w:unhideWhenUsed/>
     <w:qFormat/>
-    <w:rsid w:val="009D2541"/>
+    <w:rsid w:val="00A478BA"/>
     <w:pPr>
       <w:keepNext/>
       <w:keepLines/>
@@ -1198,7 +1188,7 @@
     <w:semiHidden/>
     <w:unhideWhenUsed/>
     <w:qFormat/>
-    <w:rsid w:val="009D2541"/>
+    <w:rsid w:val="00A478BA"/>
     <w:pPr>
       <w:keepNext/>
       <w:keepLines/>
@@ -1219,7 +1209,7 @@
     <w:semiHidden/>
     <w:unhideWhenUsed/>
     <w:qFormat/>
-    <w:rsid w:val="009D2541"/>
+    <w:rsid w:val="00A478BA"/>
     <w:pPr>
       <w:keepNext/>
       <w:keepLines/>
@@ -1242,7 +1232,7 @@
     <w:semiHidden/>
     <w:unhideWhenUsed/>
     <w:qFormat/>
-    <w:rsid w:val="009D2541"/>
+    <w:rsid w:val="00A478BA"/>
     <w:pPr>
       <w:keepNext/>
       <w:keepLines/>
@@ -1263,7 +1253,7 @@
     <w:semiHidden/>
     <w:unhideWhenUsed/>
     <w:qFormat/>
-    <w:rsid w:val="009D2541"/>
+    <w:rsid w:val="00A478BA"/>
     <w:pPr>
       <w:keepNext/>
       <w:keepLines/>
@@ -1286,7 +1276,7 @@
     <w:semiHidden/>
     <w:unhideWhenUsed/>
     <w:qFormat/>
-    <w:rsid w:val="009D2541"/>
+    <w:rsid w:val="00A478BA"/>
     <w:pPr>
       <w:keepNext/>
       <w:keepLines/>
@@ -1301,6 +1291,7 @@
   <w:style w:type="character" w:default="1" w:styleId="DefaultParagraphFont">
     <w:name w:val="Default Paragraph Font"/>
     <w:uiPriority w:val="1"/>
+    <w:semiHidden/>
     <w:unhideWhenUsed/>
   </w:style>
   <w:style w:type="table" w:default="1" w:styleId="TableNormal">
@@ -1329,7 +1320,7 @@
     <w:basedOn w:val="DefaultParagraphFont"/>
     <w:link w:val="Heading1"/>
     <w:uiPriority w:val="9"/>
-    <w:rsid w:val="009D2541"/>
+    <w:rsid w:val="00A478BA"/>
     <w:rPr>
       <w:rFonts w:asciiTheme="majorHAnsi" w:eastAsiaTheme="majorEastAsia" w:hAnsiTheme="majorHAnsi" w:cstheme="majorBidi"/>
       <w:color w:val="2F5496" w:themeColor="accent1" w:themeShade="BF"/>
@@ -1342,7 +1333,7 @@
     <w:basedOn w:val="DefaultParagraphFont"/>
     <w:link w:val="Heading2"/>
     <w:uiPriority w:val="9"/>
-    <w:rsid w:val="009D2541"/>
+    <w:rsid w:val="00A478BA"/>
     <w:rPr>
       <w:rFonts w:asciiTheme="majorHAnsi" w:eastAsiaTheme="majorEastAsia" w:hAnsiTheme="majorHAnsi" w:cstheme="majorBidi"/>
       <w:color w:val="2F5496" w:themeColor="accent1" w:themeShade="BF"/>
@@ -1356,7 +1347,7 @@
     <w:link w:val="Heading3"/>
     <w:uiPriority w:val="9"/>
     <w:semiHidden/>
-    <w:rsid w:val="009D2541"/>
+    <w:rsid w:val="00A478BA"/>
     <w:rPr>
       <w:rFonts w:eastAsiaTheme="majorEastAsia" w:cstheme="majorBidi"/>
       <w:color w:val="2F5496" w:themeColor="accent1" w:themeShade="BF"/>
@@ -1370,7 +1361,7 @@
     <w:link w:val="Heading4"/>
     <w:uiPriority w:val="9"/>
     <w:semiHidden/>
-    <w:rsid w:val="009D2541"/>
+    <w:rsid w:val="00A478BA"/>
     <w:rPr>
       <w:rFonts w:eastAsiaTheme="majorEastAsia" w:cstheme="majorBidi"/>
       <w:i/>
@@ -1384,7 +1375,7 @@
     <w:link w:val="Heading5"/>
     <w:uiPriority w:val="9"/>
     <w:semiHidden/>
-    <w:rsid w:val="009D2541"/>
+    <w:rsid w:val="00A478BA"/>
     <w:rPr>
       <w:rFonts w:eastAsiaTheme="majorEastAsia" w:cstheme="majorBidi"/>
       <w:color w:val="2F5496" w:themeColor="accent1" w:themeShade="BF"/>
@@ -1396,7 +1387,7 @@
     <w:link w:val="Heading6"/>
     <w:uiPriority w:val="9"/>
     <w:semiHidden/>
-    <w:rsid w:val="009D2541"/>
+    <w:rsid w:val="00A478BA"/>
     <w:rPr>
       <w:rFonts w:eastAsiaTheme="majorEastAsia" w:cstheme="majorBidi"/>
       <w:i/>
@@ -1410,7 +1401,7 @@
     <w:link w:val="Heading7"/>
     <w:uiPriority w:val="9"/>
     <w:semiHidden/>
-    <w:rsid w:val="009D2541"/>
+    <w:rsid w:val="00A478BA"/>
     <w:rPr>
       <w:rFonts w:eastAsiaTheme="majorEastAsia" w:cstheme="majorBidi"/>
       <w:color w:val="595959" w:themeColor="text1" w:themeTint="A6"/>
@@ -1422,7 +1413,7 @@
     <w:link w:val="Heading8"/>
     <w:uiPriority w:val="9"/>
     <w:semiHidden/>
-    <w:rsid w:val="009D2541"/>
+    <w:rsid w:val="00A478BA"/>
     <w:rPr>
       <w:rFonts w:eastAsiaTheme="majorEastAsia" w:cstheme="majorBidi"/>
       <w:i/>
@@ -1436,7 +1427,7 @@
     <w:link w:val="Heading9"/>
     <w:uiPriority w:val="9"/>
     <w:semiHidden/>
-    <w:rsid w:val="009D2541"/>
+    <w:rsid w:val="00A478BA"/>
     <w:rPr>
       <w:rFonts w:eastAsiaTheme="majorEastAsia" w:cstheme="majorBidi"/>
       <w:color w:val="272727" w:themeColor="text1" w:themeTint="D8"/>
@@ -1449,7 +1440,7 @@
     <w:link w:val="TitleChar"/>
     <w:uiPriority w:val="10"/>
     <w:qFormat/>
-    <w:rsid w:val="009D2541"/>
+    <w:rsid w:val="00A478BA"/>
     <w:pPr>
       <w:spacing w:after="80" w:line="240" w:lineRule="auto"/>
       <w:contextualSpacing/>
@@ -1467,7 +1458,7 @@
     <w:basedOn w:val="DefaultParagraphFont"/>
     <w:link w:val="Title"/>
     <w:uiPriority w:val="10"/>
-    <w:rsid w:val="009D2541"/>
+    <w:rsid w:val="00A478BA"/>
     <w:rPr>
       <w:rFonts w:asciiTheme="majorHAnsi" w:eastAsiaTheme="majorEastAsia" w:hAnsiTheme="majorHAnsi" w:cstheme="majorBidi"/>
       <w:spacing w:val="-10"/>
@@ -1483,7 +1474,7 @@
     <w:link w:val="SubtitleChar"/>
     <w:uiPriority w:val="11"/>
     <w:qFormat/>
-    <w:rsid w:val="009D2541"/>
+    <w:rsid w:val="00A478BA"/>
     <w:pPr>
       <w:numPr>
         <w:ilvl w:val="1"/>
@@ -1502,7 +1493,7 @@
     <w:basedOn w:val="DefaultParagraphFont"/>
     <w:link w:val="Subtitle"/>
     <w:uiPriority w:val="11"/>
-    <w:rsid w:val="009D2541"/>
+    <w:rsid w:val="00A478BA"/>
     <w:rPr>
       <w:rFonts w:eastAsiaTheme="majorEastAsia" w:cstheme="majorBidi"/>
       <w:color w:val="595959" w:themeColor="text1" w:themeTint="A6"/>
@@ -1518,7 +1509,7 @@
     <w:link w:val="QuoteChar"/>
     <w:uiPriority w:val="29"/>
     <w:qFormat/>
-    <w:rsid w:val="009D2541"/>
+    <w:rsid w:val="00A478BA"/>
     <w:pPr>
       <w:spacing w:before="160"/>
       <w:jc w:val="center"/>
@@ -1534,7 +1525,7 @@
     <w:basedOn w:val="DefaultParagraphFont"/>
     <w:link w:val="Quote"/>
     <w:uiPriority w:val="29"/>
-    <w:rsid w:val="009D2541"/>
+    <w:rsid w:val="00A478BA"/>
     <w:rPr>
       <w:i/>
       <w:iCs/>
@@ -1546,7 +1537,7 @@
     <w:basedOn w:val="Normal"/>
     <w:uiPriority w:val="34"/>
     <w:qFormat/>
-    <w:rsid w:val="009D2541"/>
+    <w:rsid w:val="00A478BA"/>
     <w:pPr>
       <w:ind w:left="720"/>
       <w:contextualSpacing/>
@@ -1557,7 +1548,7 @@
     <w:basedOn w:val="DefaultParagraphFont"/>
     <w:uiPriority w:val="21"/>
     <w:qFormat/>
-    <w:rsid w:val="009D2541"/>
+    <w:rsid w:val="00A478BA"/>
     <w:rPr>
       <w:i/>
       <w:iCs/>
@@ -1571,7 +1562,7 @@
     <w:link w:val="IntenseQuoteChar"/>
     <w:uiPriority w:val="30"/>
     <w:qFormat/>
-    <w:rsid w:val="009D2541"/>
+    <w:rsid w:val="00A478BA"/>
     <w:pPr>
       <w:pBdr>
         <w:top w:val="single" w:sz="4" w:space="10" w:color="2F5496" w:themeColor="accent1" w:themeShade="BF"/>
@@ -1592,7 +1583,7 @@
     <w:basedOn w:val="DefaultParagraphFont"/>
     <w:link w:val="IntenseQuote"/>
     <w:uiPriority w:val="30"/>
-    <w:rsid w:val="009D2541"/>
+    <w:rsid w:val="00A478BA"/>
     <w:rPr>
       <w:i/>
       <w:iCs/>
@@ -1604,7 +1595,7 @@
     <w:basedOn w:val="DefaultParagraphFont"/>
     <w:uiPriority w:val="32"/>
     <w:qFormat/>
-    <w:rsid w:val="009D2541"/>
+    <w:rsid w:val="00A478BA"/>
     <w:rPr>
       <w:b/>
       <w:bCs/>

</xml_diff>

<commit_message>
Knowledge - 3-Work knowledge - 1/31/2026 - part 2
</commit_message>
<xml_diff>
--- a/Knowledge/3-Work knowledge/1-Software Engineering/1-Software Engineering Fundamentals/5-My Source/1-Network Traffic/1-Types of Network Traffic/1-Types of Network Traffic.docx
+++ b/Knowledge/3-Work knowledge/1-Software Engineering/1-Software Engineering Fundamentals/5-My Source/1-Network Traffic/1-Types of Network Traffic/1-Types of Network Traffic.docx
@@ -18,59 +18,1597 @@
       </w:pPr>
       <w:r>
         <w:rPr>
-          <w:rFonts w:ascii="Arial" w:eastAsia="Arial" w:hAnsi="Arial"/>
-          <w:b/>
-          <w:sz w:val="22"/>
-          <w:shd w:val="clear" w:color="auto" w:fill="B7B7B7"/>
-        </w:rPr>
-        <w:t># Source</w:t>
-      </w:r>
-      <w:r>
-        <w:rPr>
-          <w:rFonts w:ascii="Arial" w:eastAsia="Arial" w:hAnsi="Arial"/>
-          <w:sz w:val="22"/>
-          <w:shd w:val="clear" w:color="auto" w:fill="B7B7B7"/>
-        </w:rPr>
-        <w:t xml:space="preserve">: </w:t>
-      </w:r>
-      <w:r>
-        <w:rPr>
-          <w:rFonts w:ascii="Arial" w:eastAsia="Arial" w:hAnsi="Arial"/>
-          <w:b/>
-          <w:sz w:val="22"/>
-          <w:shd w:val="clear" w:color="auto" w:fill="B7B7B7"/>
-        </w:rPr>
-        <w:t xml:space="preserve">Chatgpt </w:t>
-      </w:r>
-      <w:r>
-        <w:rPr>
-          <w:rFonts w:ascii="Arial" w:eastAsia="Arial" w:hAnsi="Arial"/>
-          <w:b/>
-          <w:sz w:val="22"/>
-          <w:szCs w:val="14"/>
-          <w:shd w:val="clear" w:color="auto" w:fill="B7B7B7"/>
-        </w:rPr>
-        <w:t>(GPT</w:t>
-      </w:r>
-      <w:r>
-        <w:rPr>
-          <w:rFonts w:ascii="Arial" w:eastAsia="Arial" w:hAnsi="Arial" w:cs="Cambria Math"/>
-          <w:b/>
-          <w:sz w:val="22"/>
-          <w:szCs w:val="14"/>
-          <w:shd w:val="clear" w:color="auto" w:fill="B7B7B7"/>
+          <w:rFonts w:ascii="Arial" w:hAnsi="Arial" w:eastAsia="Arial" w:cs="Arial"/>
+          <w:b/>
+          <w:i w:val="0"/>
+          <w:color w:val="000000"/>
+          <w:sz w:val="18"/>
+          <w:highlight w:val="lightGray"/>
+        </w:rPr>
+        <w:t>#</w:t>
+      </w:r>
+      <w:r>
+        <w:rPr>
+          <w:rFonts w:ascii="Arial" w:hAnsi="Arial" w:eastAsia="Arial" w:cs="Arial"/>
+          <w:b/>
+          <w:i w:val="0"/>
+          <w:color w:val="000000"/>
+          <w:sz w:val="18"/>
+          <w:highlight w:val="lightGray"/>
+        </w:rPr>
+        <w:t xml:space="preserve"> </w:t>
+      </w:r>
+      <w:r>
+        <w:rPr>
+          <w:rFonts w:ascii="Arial" w:hAnsi="Arial" w:eastAsia="Arial" w:cs="Arial"/>
+          <w:b/>
+          <w:i w:val="0"/>
+          <w:color w:val="000000"/>
+          <w:sz w:val="18"/>
+          <w:highlight w:val="lightGray"/>
+        </w:rPr>
+        <w:t>S</w:t>
+      </w:r>
+      <w:r>
+        <w:rPr>
+          <w:rFonts w:ascii="Arial" w:hAnsi="Arial" w:eastAsia="Arial" w:cs="Arial"/>
+          <w:b/>
+          <w:i w:val="0"/>
+          <w:color w:val="000000"/>
+          <w:sz w:val="18"/>
+          <w:highlight w:val="lightGray"/>
+        </w:rPr>
+        <w:t>o</w:t>
+      </w:r>
+      <w:r>
+        <w:rPr>
+          <w:rFonts w:ascii="Arial" w:hAnsi="Arial" w:eastAsia="Arial" w:cs="Arial"/>
+          <w:b/>
+          <w:i w:val="0"/>
+          <w:color w:val="000000"/>
+          <w:sz w:val="18"/>
+          <w:highlight w:val="lightGray"/>
+        </w:rPr>
+        <w:t>u</w:t>
+      </w:r>
+      <w:r>
+        <w:rPr>
+          <w:rFonts w:ascii="Arial" w:hAnsi="Arial" w:eastAsia="Arial" w:cs="Arial"/>
+          <w:b/>
+          <w:i w:val="0"/>
+          <w:color w:val="000000"/>
+          <w:sz w:val="18"/>
+          <w:highlight w:val="lightGray"/>
+        </w:rPr>
+        <w:t>r</w:t>
+      </w:r>
+      <w:r>
+        <w:rPr>
+          <w:rFonts w:ascii="Arial" w:hAnsi="Arial" w:eastAsia="Arial" w:cs="Arial"/>
+          <w:b/>
+          <w:i w:val="0"/>
+          <w:color w:val="000000"/>
+          <w:sz w:val="18"/>
+          <w:highlight w:val="lightGray"/>
+        </w:rPr>
+        <w:t>c</w:t>
+      </w:r>
+      <w:r>
+        <w:rPr>
+          <w:rFonts w:ascii="Arial" w:hAnsi="Arial" w:eastAsia="Arial" w:cs="Arial"/>
+          <w:b/>
+          <w:i w:val="0"/>
+          <w:color w:val="000000"/>
+          <w:sz w:val="18"/>
+          <w:highlight w:val="lightGray"/>
+        </w:rPr>
+        <w:t>e</w:t>
+      </w:r>
+      <w:r>
+        <w:rPr>
+          <w:rFonts w:ascii="Arial" w:hAnsi="Arial" w:eastAsia="Arial" w:cs="Arial"/>
+          <w:b/>
+          <w:i w:val="0"/>
+          <w:color w:val="000000"/>
+          <w:sz w:val="18"/>
+          <w:highlight w:val="lightGray"/>
+        </w:rPr>
+        <w:t>:</w:t>
+      </w:r>
+      <w:r>
+        <w:rPr>
+          <w:rFonts w:ascii="Arial" w:hAnsi="Arial" w:eastAsia="Arial" w:cs="Arial"/>
+          <w:b/>
+          <w:i w:val="0"/>
+          <w:color w:val="000000"/>
+          <w:sz w:val="18"/>
+          <w:highlight w:val="lightGray"/>
+        </w:rPr>
+        <w:t xml:space="preserve"> </w:t>
+      </w:r>
+      <w:r>
+        <w:rPr>
+          <w:rFonts w:ascii="Arial" w:hAnsi="Arial" w:eastAsia="Arial" w:cs="Arial"/>
+          <w:b/>
+          <w:i w:val="0"/>
+          <w:color w:val="000000"/>
+          <w:sz w:val="18"/>
+          <w:highlight w:val="lightGray"/>
+        </w:rPr>
+        <w:t>A</w:t>
+      </w:r>
+      <w:r>
+        <w:rPr>
+          <w:rFonts w:ascii="Arial" w:hAnsi="Arial" w:eastAsia="Arial" w:cs="Arial"/>
+          <w:b/>
+          <w:i w:val="0"/>
+          <w:color w:val="000000"/>
+          <w:sz w:val="18"/>
+          <w:highlight w:val="lightGray"/>
+        </w:rPr>
+        <w:t>I</w:t>
+      </w:r>
+      <w:r>
+        <w:rPr>
+          <w:rFonts w:ascii="Arial" w:hAnsi="Arial" w:eastAsia="Arial" w:cs="Arial"/>
+          <w:b/>
+          <w:i w:val="0"/>
+          <w:color w:val="000000"/>
+          <w:sz w:val="18"/>
+          <w:highlight w:val="lightGray"/>
+        </w:rPr>
+        <w:t xml:space="preserve"> </w:t>
+      </w:r>
+      <w:r>
+        <w:rPr>
+          <w:rFonts w:ascii="Arial" w:hAnsi="Arial" w:eastAsia="Arial" w:cs="Arial"/>
+          <w:b/>
+          <w:i w:val="0"/>
+          <w:color w:val="000000"/>
+          <w:sz w:val="18"/>
+          <w:highlight w:val="lightGray"/>
+        </w:rPr>
+        <w:t>S</w:t>
+      </w:r>
+      <w:r>
+        <w:rPr>
+          <w:rFonts w:ascii="Arial" w:hAnsi="Arial" w:eastAsia="Arial" w:cs="Arial"/>
+          <w:b/>
+          <w:i w:val="0"/>
+          <w:color w:val="000000"/>
+          <w:sz w:val="18"/>
+          <w:highlight w:val="lightGray"/>
+        </w:rPr>
+        <w:t>o</w:t>
+      </w:r>
+      <w:r>
+        <w:rPr>
+          <w:rFonts w:ascii="Arial" w:hAnsi="Arial" w:eastAsia="Arial" w:cs="Arial"/>
+          <w:b/>
+          <w:i w:val="0"/>
+          <w:color w:val="000000"/>
+          <w:sz w:val="18"/>
+          <w:highlight w:val="lightGray"/>
+        </w:rPr>
+        <w:t>u</w:t>
+      </w:r>
+      <w:r>
+        <w:rPr>
+          <w:rFonts w:ascii="Arial" w:hAnsi="Arial" w:eastAsia="Arial" w:cs="Arial"/>
+          <w:b/>
+          <w:i w:val="0"/>
+          <w:color w:val="000000"/>
+          <w:sz w:val="18"/>
+          <w:highlight w:val="lightGray"/>
+        </w:rPr>
+        <w:t>r</w:t>
+      </w:r>
+      <w:r>
+        <w:rPr>
+          <w:rFonts w:ascii="Arial" w:hAnsi="Arial" w:eastAsia="Arial" w:cs="Arial"/>
+          <w:b/>
+          <w:i w:val="0"/>
+          <w:color w:val="000000"/>
+          <w:sz w:val="18"/>
+          <w:highlight w:val="lightGray"/>
+        </w:rPr>
+        <w:t>c</w:t>
+      </w:r>
+      <w:r>
+        <w:rPr>
+          <w:rFonts w:ascii="Arial" w:hAnsi="Arial" w:eastAsia="Arial" w:cs="Arial"/>
+          <w:b/>
+          <w:i w:val="0"/>
+          <w:color w:val="000000"/>
+          <w:sz w:val="18"/>
+          <w:highlight w:val="lightGray"/>
+        </w:rPr>
+        <w:t>e</w:t>
+      </w:r>
+      <w:r>
+        <w:rPr>
+          <w:rFonts w:ascii="Arial" w:hAnsi="Arial" w:eastAsia="Arial" w:cs="Arial"/>
+          <w:b/>
+          <w:i w:val="0"/>
+          <w:color w:val="000000"/>
+          <w:sz w:val="18"/>
+          <w:highlight w:val="lightGray"/>
+        </w:rPr>
+        <w:t>:</w:t>
+      </w:r>
+      <w:r>
+        <w:rPr>
+          <w:rFonts w:ascii="Arial" w:hAnsi="Arial" w:eastAsia="Arial" w:cs="Arial"/>
+          <w:b/>
+          <w:i w:val="0"/>
+          <w:color w:val="000000"/>
+          <w:sz w:val="18"/>
+          <w:highlight w:val="lightGray"/>
+        </w:rPr>
+        <w:t xml:space="preserve"> </w:t>
+      </w:r>
+      <w:r>
+        <w:rPr>
+          <w:rFonts w:ascii="Arial" w:hAnsi="Arial" w:eastAsia="Arial" w:cs="Arial"/>
+          <w:b/>
+          <w:i w:val="0"/>
+          <w:color w:val="000000"/>
+          <w:sz w:val="18"/>
+          <w:highlight w:val="lightGray"/>
+        </w:rPr>
+        <w:t>P</w:t>
+      </w:r>
+      <w:r>
+        <w:rPr>
+          <w:rFonts w:ascii="Arial" w:hAnsi="Arial" w:eastAsia="Arial" w:cs="Arial"/>
+          <w:b/>
+          <w:i w:val="0"/>
+          <w:color w:val="000000"/>
+          <w:sz w:val="18"/>
+          <w:highlight w:val="lightGray"/>
+        </w:rPr>
+        <w:t>r</w:t>
+      </w:r>
+      <w:r>
+        <w:rPr>
+          <w:rFonts w:ascii="Arial" w:hAnsi="Arial" w:eastAsia="Arial" w:cs="Arial"/>
+          <w:b/>
+          <w:i w:val="0"/>
+          <w:color w:val="000000"/>
+          <w:sz w:val="18"/>
+          <w:highlight w:val="lightGray"/>
+        </w:rPr>
+        <w:t>o</w:t>
+      </w:r>
+      <w:r>
+        <w:rPr>
+          <w:rFonts w:ascii="Arial" w:hAnsi="Arial" w:eastAsia="Arial" w:cs="Arial"/>
+          <w:b/>
+          <w:i w:val="0"/>
+          <w:color w:val="000000"/>
+          <w:sz w:val="18"/>
+          <w:highlight w:val="lightGray"/>
+        </w:rPr>
+        <w:t>v</w:t>
+      </w:r>
+      <w:r>
+        <w:rPr>
+          <w:rFonts w:ascii="Arial" w:hAnsi="Arial" w:eastAsia="Arial" w:cs="Arial"/>
+          <w:b/>
+          <w:i w:val="0"/>
+          <w:color w:val="000000"/>
+          <w:sz w:val="18"/>
+          <w:highlight w:val="lightGray"/>
+        </w:rPr>
+        <w:t>i</w:t>
+      </w:r>
+      <w:r>
+        <w:rPr>
+          <w:rFonts w:ascii="Arial" w:hAnsi="Arial" w:eastAsia="Arial" w:cs="Arial"/>
+          <w:b/>
+          <w:i w:val="0"/>
+          <w:color w:val="000000"/>
+          <w:sz w:val="18"/>
+          <w:highlight w:val="lightGray"/>
+        </w:rPr>
+        <w:t>d</w:t>
+      </w:r>
+      <w:r>
+        <w:rPr>
+          <w:rFonts w:ascii="Arial" w:hAnsi="Arial" w:eastAsia="Arial" w:cs="Arial"/>
+          <w:b/>
+          <w:i w:val="0"/>
+          <w:color w:val="000000"/>
+          <w:sz w:val="18"/>
+          <w:highlight w:val="lightGray"/>
+        </w:rPr>
+        <w:t>e</w:t>
+      </w:r>
+      <w:r>
+        <w:rPr>
+          <w:rFonts w:ascii="Arial" w:hAnsi="Arial" w:eastAsia="Arial" w:cs="Arial"/>
+          <w:b/>
+          <w:i w:val="0"/>
+          <w:color w:val="000000"/>
+          <w:sz w:val="18"/>
+          <w:highlight w:val="lightGray"/>
+        </w:rPr>
+        <w:t>d</w:t>
+      </w:r>
+      <w:r>
+        <w:rPr>
+          <w:rFonts w:ascii="Arial" w:hAnsi="Arial" w:eastAsia="Arial" w:cs="Arial"/>
+          <w:b/>
+          <w:i w:val="0"/>
+          <w:color w:val="000000"/>
+          <w:sz w:val="18"/>
+          <w:highlight w:val="lightGray"/>
+        </w:rPr>
+        <w:t xml:space="preserve"> </w:t>
+      </w:r>
+      <w:r>
+        <w:rPr>
+          <w:rFonts w:ascii="Arial" w:hAnsi="Arial" w:eastAsia="Arial" w:cs="Arial"/>
+          <w:b/>
+          <w:i w:val="0"/>
+          <w:color w:val="000000"/>
+          <w:sz w:val="18"/>
+          <w:highlight w:val="lightGray"/>
+        </w:rPr>
+        <w:t>b</w:t>
+      </w:r>
+      <w:r>
+        <w:rPr>
+          <w:rFonts w:ascii="Arial" w:hAnsi="Arial" w:eastAsia="Arial" w:cs="Arial"/>
+          <w:b/>
+          <w:i w:val="0"/>
+          <w:color w:val="000000"/>
+          <w:sz w:val="18"/>
+          <w:highlight w:val="lightGray"/>
+        </w:rPr>
+        <w:t>y</w:t>
+      </w:r>
+      <w:r>
+        <w:rPr>
+          <w:rFonts w:ascii="Arial" w:hAnsi="Arial" w:eastAsia="Arial" w:cs="Arial"/>
+          <w:b/>
+          <w:i w:val="0"/>
+          <w:color w:val="000000"/>
+          <w:sz w:val="18"/>
+          <w:highlight w:val="lightGray"/>
+        </w:rPr>
+        <w:t>:</w:t>
+      </w:r>
+      <w:r>
+        <w:rPr>
+          <w:rFonts w:ascii="Arial" w:hAnsi="Arial" w:eastAsia="Arial" w:cs="Arial"/>
+          <w:b/>
+          <w:i w:val="0"/>
+          <w:color w:val="000000"/>
+          <w:sz w:val="18"/>
+          <w:highlight w:val="lightGray"/>
+        </w:rPr>
+        <w:t xml:space="preserve"> </w:t>
+      </w:r>
+      <w:r>
+        <w:rPr>
+          <w:rFonts w:ascii="Arial" w:hAnsi="Arial" w:eastAsia="Arial" w:cs="Arial"/>
+          <w:b/>
+          <w:i w:val="0"/>
+          <w:color w:val="000000"/>
+          <w:sz w:val="18"/>
+          <w:highlight w:val="lightGray"/>
+        </w:rPr>
+        <w:t>[</w:t>
+      </w:r>
+      <w:r>
+        <w:rPr>
+          <w:rFonts w:ascii="Arial" w:hAnsi="Arial" w:eastAsia="Arial" w:cs="Arial"/>
+          <w:b/>
+          <w:i w:val="0"/>
+          <w:color w:val="000000"/>
+          <w:sz w:val="18"/>
+          <w:highlight w:val="lightGray"/>
+        </w:rPr>
+        <w:t>D</w:t>
+      </w:r>
+      <w:r>
+        <w:rPr>
+          <w:rFonts w:ascii="Arial" w:hAnsi="Arial" w:eastAsia="Arial" w:cs="Arial"/>
+          <w:b/>
+          <w:i w:val="0"/>
+          <w:color w:val="000000"/>
+          <w:sz w:val="18"/>
+          <w:highlight w:val="lightGray"/>
+        </w:rPr>
+        <w:t>a</w:t>
+      </w:r>
+      <w:r>
+        <w:rPr>
+          <w:rFonts w:ascii="Arial" w:hAnsi="Arial" w:eastAsia="Arial" w:cs="Arial"/>
+          <w:b/>
+          <w:i w:val="0"/>
+          <w:color w:val="000000"/>
+          <w:sz w:val="18"/>
+          <w:highlight w:val="lightGray"/>
+        </w:rPr>
+        <w:t>t</w:t>
+      </w:r>
+      <w:r>
+        <w:rPr>
+          <w:rFonts w:ascii="Arial" w:hAnsi="Arial" w:eastAsia="Arial" w:cs="Arial"/>
+          <w:b/>
+          <w:i w:val="0"/>
+          <w:color w:val="000000"/>
+          <w:sz w:val="18"/>
+          <w:highlight w:val="lightGray"/>
+        </w:rPr>
+        <w:t>a</w:t>
+      </w:r>
+      <w:r>
+        <w:rPr>
+          <w:rFonts w:ascii="Arial" w:hAnsi="Arial" w:eastAsia="Arial" w:cs="Arial"/>
+          <w:b/>
+          <w:i w:val="0"/>
+          <w:color w:val="000000"/>
+          <w:sz w:val="18"/>
+          <w:highlight w:val="lightGray"/>
+        </w:rPr>
+        <w:t xml:space="preserve"> </w:t>
+      </w:r>
+      <w:r>
+        <w:rPr>
+          <w:rFonts w:ascii="Arial" w:hAnsi="Arial" w:eastAsia="Arial" w:cs="Arial"/>
+          <w:b/>
+          <w:i w:val="0"/>
+          <w:color w:val="000000"/>
+          <w:sz w:val="18"/>
+          <w:highlight w:val="lightGray"/>
+        </w:rPr>
+        <w:t>P</w:t>
+      </w:r>
+      <w:r>
+        <w:rPr>
+          <w:rFonts w:ascii="Arial" w:hAnsi="Arial" w:eastAsia="Arial" w:cs="Arial"/>
+          <w:b/>
+          <w:i w:val="0"/>
+          <w:color w:val="000000"/>
+          <w:sz w:val="18"/>
+          <w:highlight w:val="lightGray"/>
+        </w:rPr>
+        <w:t>a</w:t>
+      </w:r>
+      <w:r>
+        <w:rPr>
+          <w:rFonts w:ascii="Arial" w:hAnsi="Arial" w:eastAsia="Arial" w:cs="Arial"/>
+          <w:b/>
+          <w:i w:val="0"/>
+          <w:color w:val="000000"/>
+          <w:sz w:val="18"/>
+          <w:highlight w:val="lightGray"/>
+        </w:rPr>
+        <w:t>t</w:t>
+      </w:r>
+      <w:r>
+        <w:rPr>
+          <w:rFonts w:ascii="Arial" w:hAnsi="Arial" w:eastAsia="Arial" w:cs="Arial"/>
+          <w:b/>
+          <w:i w:val="0"/>
+          <w:color w:val="000000"/>
+          <w:sz w:val="18"/>
+          <w:highlight w:val="lightGray"/>
+        </w:rPr>
+        <w:t>h</w:t>
+      </w:r>
+      <w:r>
+        <w:rPr>
+          <w:rFonts w:ascii="Arial" w:hAnsi="Arial" w:eastAsia="Arial" w:cs="Arial"/>
+          <w:b w:val="0"/>
+          <w:i w:val="0"/>
+          <w:color w:val="000000"/>
+          <w:sz w:val="18"/>
+          <w:highlight w:val="lightGray"/>
+        </w:rPr>
+        <w:t>:</w:t>
+      </w:r>
+      <w:r>
+        <w:rPr>
+          <w:rFonts w:ascii="Arial" w:hAnsi="Arial" w:eastAsia="Arial" w:cs="Arial"/>
+          <w:b w:val="0"/>
+          <w:i w:val="0"/>
+          <w:color w:val="000000"/>
+          <w:sz w:val="18"/>
+          <w:highlight w:val="lightGray"/>
+        </w:rPr>
+        <w:t xml:space="preserve"> </w:t>
+      </w:r>
+      <w:r>
+        <w:rPr>
+          <w:rFonts w:ascii="Arial" w:hAnsi="Arial" w:eastAsia="Arial" w:cs="Arial"/>
+          <w:b w:val="0"/>
+          <w:i w:val="0"/>
+          <w:color w:val="000000"/>
+          <w:sz w:val="18"/>
+          <w:highlight w:val="lightGray"/>
+        </w:rPr>
+        <w:t>P</w:t>
+      </w:r>
+      <w:r>
+        <w:rPr>
+          <w:rFonts w:ascii="Arial" w:hAnsi="Arial" w:eastAsia="Arial" w:cs="Arial"/>
+          <w:b w:val="0"/>
+          <w:i w:val="0"/>
+          <w:color w:val="000000"/>
+          <w:sz w:val="18"/>
+          <w:highlight w:val="lightGray"/>
+        </w:rPr>
+        <w:t>e</w:t>
+      </w:r>
+      <w:r>
+        <w:rPr>
+          <w:rFonts w:ascii="Arial" w:hAnsi="Arial" w:eastAsia="Arial" w:cs="Arial"/>
+          <w:b w:val="0"/>
+          <w:i w:val="0"/>
+          <w:color w:val="000000"/>
+          <w:sz w:val="18"/>
+          <w:highlight w:val="lightGray"/>
+        </w:rPr>
+        <w:t>r</w:t>
+      </w:r>
+      <w:r>
+        <w:rPr>
+          <w:rFonts w:ascii="Arial" w:hAnsi="Arial" w:eastAsia="Arial" w:cs="Arial"/>
+          <w:b w:val="0"/>
+          <w:i w:val="0"/>
+          <w:color w:val="000000"/>
+          <w:sz w:val="18"/>
+          <w:highlight w:val="lightGray"/>
+        </w:rPr>
+        <w:t>s</w:t>
+      </w:r>
+      <w:r>
+        <w:rPr>
+          <w:rFonts w:ascii="Arial" w:hAnsi="Arial" w:eastAsia="Arial" w:cs="Arial"/>
+          <w:b w:val="0"/>
+          <w:i w:val="0"/>
+          <w:color w:val="000000"/>
+          <w:sz w:val="18"/>
+          <w:highlight w:val="lightGray"/>
+        </w:rPr>
+        <w:t>o</w:t>
+      </w:r>
+      <w:r>
+        <w:rPr>
+          <w:rFonts w:ascii="Arial" w:hAnsi="Arial" w:eastAsia="Arial" w:cs="Arial"/>
+          <w:b w:val="0"/>
+          <w:i w:val="0"/>
+          <w:color w:val="000000"/>
+          <w:sz w:val="18"/>
+          <w:highlight w:val="lightGray"/>
+        </w:rPr>
+        <w:t>n</w:t>
+      </w:r>
+      <w:r>
+        <w:rPr>
+          <w:rFonts w:ascii="Arial" w:hAnsi="Arial" w:eastAsia="Arial" w:cs="Arial"/>
+          <w:b w:val="0"/>
+          <w:i w:val="0"/>
+          <w:color w:val="000000"/>
+          <w:sz w:val="18"/>
+          <w:highlight w:val="lightGray"/>
+        </w:rPr>
+        <w:t>s</w:t>
+      </w:r>
+      <w:r>
+        <w:rPr>
+          <w:rFonts w:ascii="Arial" w:hAnsi="Arial" w:eastAsia="Arial" w:cs="Arial"/>
+          <w:b w:val="0"/>
+          <w:i w:val="0"/>
+          <w:color w:val="000000"/>
+          <w:sz w:val="18"/>
+          <w:highlight w:val="lightGray"/>
+        </w:rPr>
+        <w:t xml:space="preserve"> </w:t>
+      </w:r>
+      <w:r>
+        <w:rPr>
+          <w:rFonts w:ascii="Arial" w:hAnsi="Arial" w:eastAsia="Arial" w:cs="Arial"/>
+          <w:b w:val="0"/>
+          <w:i w:val="0"/>
+          <w:color w:val="000000"/>
+          <w:sz w:val="18"/>
+          <w:highlight w:val="lightGray"/>
+        </w:rPr>
+        <w:t>T</w:t>
+      </w:r>
+      <w:r>
+        <w:rPr>
+          <w:rFonts w:ascii="Arial" w:hAnsi="Arial" w:eastAsia="Arial" w:cs="Arial"/>
+          <w:b w:val="0"/>
+          <w:i w:val="0"/>
+          <w:color w:val="000000"/>
+          <w:sz w:val="18"/>
+          <w:highlight w:val="lightGray"/>
+        </w:rPr>
+        <w:t>a</w:t>
+      </w:r>
+      <w:r>
+        <w:rPr>
+          <w:rFonts w:ascii="Arial" w:hAnsi="Arial" w:eastAsia="Arial" w:cs="Arial"/>
+          <w:b w:val="0"/>
+          <w:i w:val="0"/>
+          <w:color w:val="000000"/>
+          <w:sz w:val="18"/>
+          <w:highlight w:val="lightGray"/>
+        </w:rPr>
+        <w:t>b</w:t>
+      </w:r>
+      <w:r>
+        <w:rPr>
+          <w:rFonts w:ascii="Arial" w:hAnsi="Arial" w:eastAsia="Arial" w:cs="Arial"/>
+          <w:b w:val="0"/>
+          <w:i w:val="0"/>
+          <w:color w:val="000000"/>
+          <w:sz w:val="18"/>
+          <w:highlight w:val="lightGray"/>
+        </w:rPr>
+        <w:t>l</w:t>
+      </w:r>
+      <w:r>
+        <w:rPr>
+          <w:rFonts w:ascii="Arial" w:hAnsi="Arial" w:eastAsia="Arial" w:cs="Arial"/>
+          <w:b w:val="0"/>
+          <w:i w:val="0"/>
+          <w:color w:val="000000"/>
+          <w:sz w:val="18"/>
+          <w:highlight w:val="lightGray"/>
+        </w:rPr>
+        <w:t>e</w:t>
+      </w:r>
+      <w:r>
+        <w:rPr>
+          <w:rFonts w:ascii="Arial" w:hAnsi="Arial" w:eastAsia="Arial" w:cs="Arial"/>
+          <w:b w:val="0"/>
+          <w:i w:val="0"/>
+          <w:color w:val="000000"/>
+          <w:sz w:val="18"/>
+          <w:highlight w:val="lightGray"/>
+        </w:rPr>
+        <w:t xml:space="preserve"> </w:t>
+      </w:r>
+      <w:r>
+        <w:rPr>
+          <w:rFonts w:ascii="Arial" w:hAnsi="Arial" w:eastAsia="Arial" w:cs="Arial"/>
+          <w:b w:val="0"/>
+          <w:i w:val="0"/>
+          <w:color w:val="000000"/>
+          <w:sz w:val="18"/>
+          <w:highlight w:val="lightGray"/>
+        </w:rPr>
+        <w:t>-</w:t>
+      </w:r>
+      <w:r>
+        <w:rPr>
+          <w:rFonts w:ascii="Arial" w:hAnsi="Arial" w:eastAsia="Arial" w:cs="Arial"/>
+          <w:b w:val="0"/>
+          <w:i w:val="0"/>
+          <w:color w:val="000000"/>
+          <w:sz w:val="18"/>
+          <w:highlight w:val="lightGray"/>
+        </w:rPr>
+        <w:t>&gt;</w:t>
+      </w:r>
+      <w:r>
+        <w:rPr>
+          <w:rFonts w:ascii="Arial" w:hAnsi="Arial" w:eastAsia="Arial" w:cs="Arial"/>
+          <w:b w:val="0"/>
+          <w:i w:val="0"/>
+          <w:color w:val="000000"/>
+          <w:sz w:val="18"/>
+          <w:highlight w:val="lightGray"/>
+        </w:rPr>
+        <w:t xml:space="preserve"> </w:t>
+      </w:r>
+      <w:r>
+        <w:rPr>
+          <w:rFonts w:ascii="Arial" w:hAnsi="Arial" w:eastAsia="Arial" w:cs="Arial"/>
+          <w:b w:val="0"/>
+          <w:i w:val="0"/>
+          <w:color w:val="000000"/>
+          <w:sz w:val="18"/>
+          <w:highlight w:val="lightGray"/>
+        </w:rPr>
+        <w:t>I</w:t>
+      </w:r>
+      <w:r>
+        <w:rPr>
+          <w:rFonts w:ascii="Arial" w:hAnsi="Arial" w:eastAsia="Arial" w:cs="Arial"/>
+          <w:b w:val="0"/>
+          <w:i w:val="0"/>
+          <w:color w:val="000000"/>
+          <w:sz w:val="18"/>
+          <w:highlight w:val="lightGray"/>
+        </w:rPr>
+        <w:t>D</w:t>
+      </w:r>
+      <w:r>
+        <w:rPr>
+          <w:rFonts w:ascii="Arial" w:hAnsi="Arial" w:eastAsia="Arial" w:cs="Arial"/>
+          <w:b w:val="0"/>
+          <w:i w:val="0"/>
+          <w:color w:val="000000"/>
+          <w:sz w:val="18"/>
+          <w:highlight w:val="lightGray"/>
+        </w:rPr>
+        <w:t xml:space="preserve"> </w:t>
+      </w:r>
+      <w:r>
+        <w:rPr>
+          <w:rFonts w:ascii="Arial" w:hAnsi="Arial" w:eastAsia="Arial" w:cs="Arial"/>
+          <w:b w:val="0"/>
+          <w:i w:val="0"/>
+          <w:color w:val="000000"/>
+          <w:sz w:val="18"/>
+          <w:highlight w:val="lightGray"/>
+        </w:rPr>
+        <w:t>C</w:t>
+      </w:r>
+      <w:r>
+        <w:rPr>
+          <w:rFonts w:ascii="Arial" w:hAnsi="Arial" w:eastAsia="Arial" w:cs="Arial"/>
+          <w:b w:val="0"/>
+          <w:i w:val="0"/>
+          <w:color w:val="000000"/>
+          <w:sz w:val="18"/>
+          <w:highlight w:val="lightGray"/>
+        </w:rPr>
+        <w:t>o</w:t>
+      </w:r>
+      <w:r>
+        <w:rPr>
+          <w:rFonts w:ascii="Arial" w:hAnsi="Arial" w:eastAsia="Arial" w:cs="Arial"/>
+          <w:b w:val="0"/>
+          <w:i w:val="0"/>
+          <w:color w:val="000000"/>
+          <w:sz w:val="18"/>
+          <w:highlight w:val="lightGray"/>
+        </w:rPr>
+        <w:t>l</w:t>
+      </w:r>
+      <w:r>
+        <w:rPr>
+          <w:rFonts w:ascii="Arial" w:hAnsi="Arial" w:eastAsia="Arial" w:cs="Arial"/>
+          <w:b w:val="0"/>
+          <w:i w:val="0"/>
+          <w:color w:val="000000"/>
+          <w:sz w:val="18"/>
+          <w:highlight w:val="lightGray"/>
+        </w:rPr>
+        <w:t>u</w:t>
+      </w:r>
+      <w:r>
+        <w:rPr>
+          <w:rFonts w:ascii="Arial" w:hAnsi="Arial" w:eastAsia="Arial" w:cs="Arial"/>
+          <w:b w:val="0"/>
+          <w:i w:val="0"/>
+          <w:color w:val="000000"/>
+          <w:sz w:val="18"/>
+          <w:highlight w:val="lightGray"/>
+        </w:rPr>
+        <w:t>m</w:t>
+      </w:r>
+      <w:r>
+        <w:rPr>
+          <w:rFonts w:ascii="Arial" w:hAnsi="Arial" w:eastAsia="Arial" w:cs="Arial"/>
+          <w:b w:val="0"/>
+          <w:i w:val="0"/>
+          <w:color w:val="000000"/>
+          <w:sz w:val="18"/>
+          <w:highlight w:val="lightGray"/>
+        </w:rPr>
+        <w:t>n</w:t>
+      </w:r>
+      <w:r>
+        <w:rPr>
+          <w:rFonts w:ascii="Arial" w:hAnsi="Arial" w:eastAsia="Arial" w:cs="Arial"/>
+          <w:b w:val="0"/>
+          <w:i w:val="0"/>
+          <w:color w:val="000000"/>
+          <w:sz w:val="18"/>
+          <w:highlight w:val="lightGray"/>
+        </w:rPr>
+        <w:t>:</w:t>
+      </w:r>
+      <w:r>
+        <w:rPr>
+          <w:rFonts w:ascii="Arial" w:hAnsi="Arial" w:eastAsia="Arial" w:cs="Arial"/>
+          <w:b w:val="0"/>
+          <w:i w:val="0"/>
+          <w:color w:val="000000"/>
+          <w:sz w:val="18"/>
+          <w:highlight w:val="lightGray"/>
+        </w:rPr>
+        <w:t xml:space="preserve"> </w:t>
+      </w:r>
+      <w:r>
+        <w:rPr>
+          <w:rFonts w:ascii="Arial" w:hAnsi="Arial" w:eastAsia="Arial" w:cs="Arial"/>
+          <w:b w:val="0"/>
+          <w:i w:val="0"/>
+          <w:color w:val="000000"/>
+          <w:sz w:val="18"/>
+          <w:highlight w:val="lightGray"/>
+        </w:rPr>
+        <w:t>1</w:t>
+      </w:r>
+      <w:r>
+        <w:rPr>
+          <w:rFonts w:ascii="Arial" w:hAnsi="Arial" w:eastAsia="Arial" w:cs="Arial"/>
+          <w:b w:val="0"/>
+          <w:i w:val="0"/>
+          <w:color w:val="000000"/>
+          <w:sz w:val="18"/>
+          <w:highlight w:val="lightGray"/>
+        </w:rPr>
+        <w:t>,</w:t>
+      </w:r>
+      <w:r>
+        <w:rPr>
+          <w:rFonts w:ascii="Arial" w:hAnsi="Arial" w:eastAsia="Arial" w:cs="Arial"/>
+          <w:b w:val="0"/>
+          <w:i w:val="0"/>
+          <w:color w:val="000000"/>
+          <w:sz w:val="18"/>
+          <w:highlight w:val="lightGray"/>
+        </w:rPr>
+        <w:t xml:space="preserve"> </w:t>
+      </w:r>
+      <w:r>
+        <w:rPr>
+          <w:rFonts w:ascii="Arial" w:hAnsi="Arial" w:eastAsia="Arial" w:cs="Arial"/>
+          <w:b w:val="0"/>
+          <w:i w:val="0"/>
+          <w:color w:val="000000"/>
+          <w:sz w:val="18"/>
+          <w:highlight w:val="lightGray"/>
+        </w:rPr>
+        <w:t>N</w:t>
+      </w:r>
+      <w:r>
+        <w:rPr>
+          <w:rFonts w:ascii="Arial" w:hAnsi="Arial" w:eastAsia="Arial" w:cs="Arial"/>
+          <w:b w:val="0"/>
+          <w:i w:val="0"/>
+          <w:color w:val="000000"/>
+          <w:sz w:val="18"/>
+          <w:highlight w:val="lightGray"/>
+        </w:rPr>
+        <w:t>a</w:t>
+      </w:r>
+      <w:r>
+        <w:rPr>
+          <w:rFonts w:ascii="Arial" w:hAnsi="Arial" w:eastAsia="Arial" w:cs="Arial"/>
+          <w:b w:val="0"/>
+          <w:i w:val="0"/>
+          <w:color w:val="000000"/>
+          <w:sz w:val="18"/>
+          <w:highlight w:val="lightGray"/>
+        </w:rPr>
+        <w:t>m</w:t>
+      </w:r>
+      <w:r>
+        <w:rPr>
+          <w:rFonts w:ascii="Arial" w:hAnsi="Arial" w:eastAsia="Arial" w:cs="Arial"/>
+          <w:b w:val="0"/>
+          <w:i w:val="0"/>
+          <w:color w:val="000000"/>
+          <w:sz w:val="18"/>
+          <w:highlight w:val="lightGray"/>
+        </w:rPr>
+        <w:t>e</w:t>
+      </w:r>
+      <w:r>
+        <w:rPr>
+          <w:rFonts w:ascii="Arial" w:hAnsi="Arial" w:eastAsia="Arial" w:cs="Arial"/>
+          <w:b w:val="0"/>
+          <w:i w:val="0"/>
+          <w:color w:val="000000"/>
+          <w:sz w:val="18"/>
+          <w:highlight w:val="lightGray"/>
+        </w:rPr>
+        <w:t>_</w:t>
+      </w:r>
+      <w:r>
+        <w:rPr>
+          <w:rFonts w:ascii="Arial" w:hAnsi="Arial" w:eastAsia="Arial" w:cs="Arial"/>
+          <w:b w:val="0"/>
+          <w:i w:val="0"/>
+          <w:color w:val="000000"/>
+          <w:sz w:val="18"/>
+          <w:highlight w:val="lightGray"/>
+        </w:rPr>
+        <w:t>E</w:t>
+      </w:r>
+      <w:r>
+        <w:rPr>
+          <w:rFonts w:ascii="Arial" w:hAnsi="Arial" w:eastAsia="Arial" w:cs="Arial"/>
+          <w:b w:val="0"/>
+          <w:i w:val="0"/>
+          <w:color w:val="000000"/>
+          <w:sz w:val="18"/>
+          <w:highlight w:val="lightGray"/>
+        </w:rPr>
+        <w:t>n</w:t>
+      </w:r>
+      <w:r>
+        <w:rPr>
+          <w:rFonts w:ascii="Arial" w:hAnsi="Arial" w:eastAsia="Arial" w:cs="Arial"/>
+          <w:b w:val="0"/>
+          <w:i w:val="0"/>
+          <w:color w:val="000000"/>
+          <w:sz w:val="18"/>
+          <w:highlight w:val="lightGray"/>
+        </w:rPr>
+        <w:t xml:space="preserve"> </w:t>
+      </w:r>
+      <w:r>
+        <w:rPr>
+          <w:rFonts w:ascii="Arial" w:hAnsi="Arial" w:eastAsia="Arial" w:cs="Arial"/>
+          <w:b w:val="0"/>
+          <w:i w:val="0"/>
+          <w:color w:val="000000"/>
+          <w:sz w:val="18"/>
+          <w:highlight w:val="lightGray"/>
+        </w:rPr>
+        <w:t>C</w:t>
+      </w:r>
+      <w:r>
+        <w:rPr>
+          <w:rFonts w:ascii="Arial" w:hAnsi="Arial" w:eastAsia="Arial" w:cs="Arial"/>
+          <w:b w:val="0"/>
+          <w:i w:val="0"/>
+          <w:color w:val="000000"/>
+          <w:sz w:val="18"/>
+          <w:highlight w:val="lightGray"/>
+        </w:rPr>
+        <w:t>o</w:t>
+      </w:r>
+      <w:r>
+        <w:rPr>
+          <w:rFonts w:ascii="Arial" w:hAnsi="Arial" w:eastAsia="Arial" w:cs="Arial"/>
+          <w:b w:val="0"/>
+          <w:i w:val="0"/>
+          <w:color w:val="000000"/>
+          <w:sz w:val="18"/>
+          <w:highlight w:val="lightGray"/>
+        </w:rPr>
+        <w:t>l</w:t>
+      </w:r>
+      <w:r>
+        <w:rPr>
+          <w:rFonts w:ascii="Arial" w:hAnsi="Arial" w:eastAsia="Arial" w:cs="Arial"/>
+          <w:b w:val="0"/>
+          <w:i w:val="0"/>
+          <w:color w:val="000000"/>
+          <w:sz w:val="18"/>
+          <w:highlight w:val="lightGray"/>
+        </w:rPr>
+        <w:t>u</w:t>
+      </w:r>
+      <w:r>
+        <w:rPr>
+          <w:rFonts w:ascii="Arial" w:hAnsi="Arial" w:eastAsia="Arial" w:cs="Arial"/>
+          <w:b w:val="0"/>
+          <w:i w:val="0"/>
+          <w:color w:val="000000"/>
+          <w:sz w:val="18"/>
+          <w:highlight w:val="lightGray"/>
+        </w:rPr>
+        <w:t>m</w:t>
+      </w:r>
+      <w:r>
+        <w:rPr>
+          <w:rFonts w:ascii="Arial" w:hAnsi="Arial" w:eastAsia="Arial" w:cs="Arial"/>
+          <w:b w:val="0"/>
+          <w:i w:val="0"/>
+          <w:color w:val="000000"/>
+          <w:sz w:val="18"/>
+          <w:highlight w:val="lightGray"/>
+        </w:rPr>
+        <w:t>n</w:t>
+      </w:r>
+      <w:r>
+        <w:rPr>
+          <w:rFonts w:ascii="Arial" w:hAnsi="Arial" w:eastAsia="Arial" w:cs="Arial"/>
+          <w:b w:val="0"/>
+          <w:i w:val="0"/>
+          <w:color w:val="000000"/>
+          <w:sz w:val="18"/>
+          <w:highlight w:val="lightGray"/>
+        </w:rPr>
+        <w:t>:</w:t>
+      </w:r>
+      <w:r>
+        <w:rPr>
+          <w:rFonts w:ascii="Arial" w:hAnsi="Arial" w:eastAsia="Arial" w:cs="Arial"/>
+          <w:b w:val="0"/>
+          <w:i w:val="0"/>
+          <w:color w:val="000000"/>
+          <w:sz w:val="18"/>
+          <w:highlight w:val="lightGray"/>
+        </w:rPr>
+        <w:t xml:space="preserve"> </w:t>
+      </w:r>
+      <w:r>
+        <w:rPr>
+          <w:rFonts w:ascii="Arial" w:hAnsi="Arial" w:eastAsia="Arial" w:cs="Arial"/>
+          <w:b w:val="0"/>
+          <w:i w:val="0"/>
+          <w:color w:val="000000"/>
+          <w:sz w:val="18"/>
+          <w:highlight w:val="lightGray"/>
+        </w:rPr>
+        <w:t>M</w:t>
+      </w:r>
+      <w:r>
+        <w:rPr>
+          <w:rFonts w:ascii="Arial" w:hAnsi="Arial" w:eastAsia="Arial" w:cs="Arial"/>
+          <w:b w:val="0"/>
+          <w:i w:val="0"/>
+          <w:color w:val="000000"/>
+          <w:sz w:val="18"/>
+          <w:highlight w:val="lightGray"/>
+        </w:rPr>
+        <w:t>o</w:t>
+      </w:r>
+      <w:r>
+        <w:rPr>
+          <w:rFonts w:ascii="Arial" w:hAnsi="Arial" w:eastAsia="Arial" w:cs="Arial"/>
+          <w:b w:val="0"/>
+          <w:i w:val="0"/>
+          <w:color w:val="000000"/>
+          <w:sz w:val="18"/>
+          <w:highlight w:val="lightGray"/>
+        </w:rPr>
+        <w:t>t</w:t>
+      </w:r>
+      <w:r>
+        <w:rPr>
+          <w:rFonts w:ascii="Arial" w:hAnsi="Arial" w:eastAsia="Arial" w:cs="Arial"/>
+          <w:b w:val="0"/>
+          <w:i w:val="0"/>
+          <w:color w:val="000000"/>
+          <w:sz w:val="18"/>
+          <w:highlight w:val="lightGray"/>
+        </w:rPr>
+        <w:t>a</w:t>
+      </w:r>
+      <w:r>
+        <w:rPr>
+          <w:rFonts w:ascii="Arial" w:hAnsi="Arial" w:eastAsia="Arial" w:cs="Arial"/>
+          <w:b w:val="0"/>
+          <w:i w:val="0"/>
+          <w:color w:val="000000"/>
+          <w:sz w:val="18"/>
+          <w:highlight w:val="lightGray"/>
+        </w:rPr>
+        <w:t>s</w:t>
+      </w:r>
+      <w:r>
+        <w:rPr>
+          <w:rFonts w:ascii="Arial" w:hAnsi="Arial" w:eastAsia="Arial" w:cs="Arial"/>
+          <w:b w:val="0"/>
+          <w:i w:val="0"/>
+          <w:color w:val="000000"/>
+          <w:sz w:val="18"/>
+          <w:highlight w:val="lightGray"/>
+        </w:rPr>
+        <w:t>e</w:t>
+      </w:r>
+      <w:r>
+        <w:rPr>
+          <w:rFonts w:ascii="Arial" w:hAnsi="Arial" w:eastAsia="Arial" w:cs="Arial"/>
+          <w:b w:val="0"/>
+          <w:i w:val="0"/>
+          <w:color w:val="000000"/>
+          <w:sz w:val="18"/>
+          <w:highlight w:val="lightGray"/>
+        </w:rPr>
+        <w:t>m</w:t>
+      </w:r>
+      <w:r>
+        <w:rPr>
+          <w:rFonts w:ascii="Arial" w:hAnsi="Arial" w:eastAsia="Arial" w:cs="Arial"/>
+          <w:b w:val="0"/>
+          <w:i w:val="0"/>
+          <w:color w:val="000000"/>
+          <w:sz w:val="18"/>
+          <w:highlight w:val="lightGray"/>
+        </w:rPr>
+        <w:t xml:space="preserve"> </w:t>
+      </w:r>
+      <w:r>
+        <w:rPr>
+          <w:rFonts w:ascii="Arial" w:hAnsi="Arial" w:eastAsia="Arial" w:cs="Arial"/>
+          <w:b w:val="0"/>
+          <w:i w:val="0"/>
+          <w:color w:val="000000"/>
+          <w:sz w:val="18"/>
+          <w:highlight w:val="lightGray"/>
+        </w:rPr>
+        <w:t>E</w:t>
+      </w:r>
+      <w:r>
+        <w:rPr>
+          <w:rFonts w:ascii="Arial" w:hAnsi="Arial" w:eastAsia="Arial" w:cs="Arial"/>
+          <w:b w:val="0"/>
+          <w:i w:val="0"/>
+          <w:color w:val="000000"/>
+          <w:sz w:val="18"/>
+          <w:highlight w:val="lightGray"/>
+        </w:rPr>
+        <w:t>s</w:t>
+      </w:r>
+      <w:r>
+        <w:rPr>
+          <w:rFonts w:ascii="Arial" w:hAnsi="Arial" w:eastAsia="Arial" w:cs="Arial"/>
+          <w:b w:val="0"/>
+          <w:i w:val="0"/>
+          <w:color w:val="000000"/>
+          <w:sz w:val="18"/>
+          <w:highlight w:val="lightGray"/>
+        </w:rPr>
+        <w:t>s</w:t>
+      </w:r>
+      <w:r>
+        <w:rPr>
+          <w:rFonts w:ascii="Arial" w:hAnsi="Arial" w:eastAsia="Arial" w:cs="Arial"/>
+          <w:b w:val="0"/>
+          <w:i w:val="0"/>
+          <w:color w:val="000000"/>
+          <w:sz w:val="18"/>
+          <w:highlight w:val="lightGray"/>
+        </w:rPr>
+        <w:t>a</w:t>
+      </w:r>
+      <w:r>
+        <w:rPr>
+          <w:rFonts w:ascii="Arial" w:hAnsi="Arial" w:eastAsia="Arial" w:cs="Arial"/>
+          <w:b w:val="0"/>
+          <w:i w:val="0"/>
+          <w:color w:val="000000"/>
+          <w:sz w:val="18"/>
+          <w:highlight w:val="lightGray"/>
+        </w:rPr>
+        <w:t>m</w:t>
+      </w:r>
+      <w:r>
+        <w:rPr>
+          <w:rFonts w:ascii="Arial" w:hAnsi="Arial" w:eastAsia="Arial" w:cs="Arial"/>
+          <w:b w:val="0"/>
+          <w:i w:val="0"/>
+          <w:color w:val="000000"/>
+          <w:sz w:val="18"/>
+          <w:highlight w:val="lightGray"/>
+        </w:rPr>
+        <w:t>]</w:t>
+      </w:r>
+      <w:r>
+        <w:rPr>
+          <w:rFonts w:ascii="Arial" w:hAnsi="Arial" w:eastAsia="Arial" w:cs="Arial"/>
+          <w:b w:val="0"/>
+          <w:i w:val="0"/>
+          <w:color w:val="000000"/>
+          <w:sz w:val="18"/>
+          <w:highlight w:val="lightGray"/>
+        </w:rPr>
+        <w:t xml:space="preserve"> </w:t>
+      </w:r>
+      <w:r>
+        <w:rPr>
+          <w:rFonts w:ascii="Arial" w:hAnsi="Arial" w:eastAsia="Arial" w:cs="Arial"/>
+          <w:b w:val="0"/>
+          <w:i w:val="0"/>
+          <w:color w:val="000000"/>
+          <w:sz w:val="18"/>
+          <w:highlight w:val="lightGray"/>
+        </w:rPr>
+        <w:t>-</w:t>
+      </w:r>
+      <w:r>
+        <w:rPr>
+          <w:rFonts w:ascii="Arial" w:hAnsi="Arial" w:eastAsia="Arial" w:cs="Arial"/>
+          <w:b w:val="0"/>
+          <w:i w:val="0"/>
+          <w:color w:val="000000"/>
+          <w:sz w:val="18"/>
+          <w:highlight w:val="lightGray"/>
+        </w:rPr>
+        <w:t>&gt;</w:t>
+      </w:r>
+      <w:r>
+        <w:rPr>
+          <w:rFonts w:ascii="Arial" w:hAnsi="Arial" w:eastAsia="Arial" w:cs="Arial"/>
+          <w:b w:val="0"/>
+          <w:i w:val="0"/>
+          <w:color w:val="000000"/>
+          <w:sz w:val="18"/>
+          <w:highlight w:val="lightGray"/>
+        </w:rPr>
+        <w:t xml:space="preserve"> </w:t>
+      </w:r>
+      <w:r>
+        <w:rPr>
+          <w:rFonts w:ascii="Arial" w:hAnsi="Arial" w:eastAsia="Arial" w:cs="Arial"/>
+          <w:b/>
+          <w:i w:val="0"/>
+          <w:color w:val="000000"/>
+          <w:sz w:val="18"/>
+          <w:highlight w:val="lightGray"/>
+        </w:rPr>
+        <w:t>F</w:t>
+      </w:r>
+      <w:r>
+        <w:rPr>
+          <w:rFonts w:ascii="Arial" w:hAnsi="Arial" w:eastAsia="Arial" w:cs="Arial"/>
+          <w:b/>
+          <w:i w:val="0"/>
+          <w:color w:val="000000"/>
+          <w:sz w:val="18"/>
+          <w:highlight w:val="lightGray"/>
+        </w:rPr>
+        <w:t>r</w:t>
+      </w:r>
+      <w:r>
+        <w:rPr>
+          <w:rFonts w:ascii="Arial" w:hAnsi="Arial" w:eastAsia="Arial" w:cs="Arial"/>
+          <w:b/>
+          <w:i w:val="0"/>
+          <w:color w:val="000000"/>
+          <w:sz w:val="18"/>
+          <w:highlight w:val="lightGray"/>
+        </w:rPr>
+        <w:t>o</w:t>
+      </w:r>
+      <w:r>
+        <w:rPr>
+          <w:rFonts w:ascii="Arial" w:hAnsi="Arial" w:eastAsia="Arial" w:cs="Arial"/>
+          <w:b/>
+          <w:i w:val="0"/>
+          <w:color w:val="000000"/>
+          <w:sz w:val="18"/>
+          <w:highlight w:val="lightGray"/>
+        </w:rPr>
+        <w:t>m</w:t>
+      </w:r>
+      <w:r>
+        <w:rPr>
+          <w:rFonts w:ascii="Arial" w:hAnsi="Arial" w:eastAsia="Arial" w:cs="Arial"/>
+          <w:b/>
+          <w:i w:val="0"/>
+          <w:color w:val="000000"/>
+          <w:sz w:val="18"/>
+          <w:highlight w:val="lightGray"/>
+        </w:rPr>
+        <w:t>:</w:t>
+      </w:r>
+      <w:r>
+        <w:rPr>
+          <w:rFonts w:ascii="Arial" w:hAnsi="Arial" w:eastAsia="Arial" w:cs="Arial"/>
+          <w:b w:val="0"/>
+          <w:i w:val="0"/>
+          <w:color w:val="000000"/>
+          <w:sz w:val="18"/>
+          <w:highlight w:val="lightGray"/>
+        </w:rPr>
+        <w:t xml:space="preserve"> </w:t>
+      </w:r>
+      <w:r>
+        <w:rPr>
+          <w:rFonts w:ascii="Arial" w:hAnsi="Arial" w:eastAsia="Arial" w:cs="Arial"/>
+          <w:b w:val="0"/>
+          <w:i w:val="0"/>
+          <w:color w:val="000000"/>
+          <w:sz w:val="18"/>
+          <w:highlight w:val="lightGray"/>
+        </w:rPr>
+        <w:t>[</w:t>
+      </w:r>
+      <w:r>
+        <w:rPr>
+          <w:rFonts w:ascii="Arial" w:hAnsi="Arial" w:eastAsia="Arial" w:cs="Arial"/>
+          <w:b w:val="0"/>
+          <w:i w:val="0"/>
+          <w:color w:val="000000"/>
+          <w:sz w:val="18"/>
+          <w:highlight w:val="lightGray"/>
+        </w:rPr>
+        <w:t>C</w:t>
+      </w:r>
+      <w:r>
+        <w:rPr>
+          <w:rFonts w:ascii="Arial" w:hAnsi="Arial" w:eastAsia="Arial" w:cs="Arial"/>
+          <w:b w:val="0"/>
+          <w:i w:val="0"/>
+          <w:color w:val="000000"/>
+          <w:sz w:val="18"/>
+          <w:highlight w:val="lightGray"/>
+        </w:rPr>
+        <w:t>h</w:t>
+      </w:r>
+      <w:r>
+        <w:rPr>
+          <w:rFonts w:ascii="Arial" w:hAnsi="Arial" w:eastAsia="Arial" w:cs="Arial"/>
+          <w:b w:val="0"/>
+          <w:i w:val="0"/>
+          <w:color w:val="000000"/>
+          <w:sz w:val="18"/>
+          <w:highlight w:val="lightGray"/>
+        </w:rPr>
+        <w:t>a</w:t>
+      </w:r>
+      <w:r>
+        <w:rPr>
+          <w:rFonts w:ascii="Arial" w:hAnsi="Arial" w:eastAsia="Arial" w:cs="Arial"/>
+          <w:b w:val="0"/>
+          <w:i w:val="0"/>
+          <w:color w:val="000000"/>
+          <w:sz w:val="18"/>
+          <w:highlight w:val="lightGray"/>
+        </w:rPr>
+        <w:t>t</w:t>
+      </w:r>
+      <w:r>
+        <w:rPr>
+          <w:rFonts w:ascii="Arial" w:hAnsi="Arial" w:eastAsia="Arial" w:cs="Arial"/>
+          <w:b w:val="0"/>
+          <w:i w:val="0"/>
+          <w:color w:val="000000"/>
+          <w:sz w:val="18"/>
+          <w:highlight w:val="lightGray"/>
+        </w:rPr>
+        <w:t>g</w:t>
+      </w:r>
+      <w:r>
+        <w:rPr>
+          <w:rFonts w:ascii="Arial" w:hAnsi="Arial" w:eastAsia="Arial" w:cs="Arial"/>
+          <w:b w:val="0"/>
+          <w:i w:val="0"/>
+          <w:color w:val="000000"/>
+          <w:sz w:val="18"/>
+          <w:highlight w:val="lightGray"/>
+        </w:rPr>
+        <w:t>p</w:t>
+      </w:r>
+      <w:r>
+        <w:rPr>
+          <w:rFonts w:ascii="Arial" w:hAnsi="Arial" w:eastAsia="Arial" w:cs="Arial"/>
+          <w:b w:val="0"/>
+          <w:i w:val="0"/>
+          <w:color w:val="000000"/>
+          <w:sz w:val="18"/>
+          <w:highlight w:val="lightGray"/>
+        </w:rPr>
+        <w:t>t</w:t>
+      </w:r>
+      <w:r>
+        <w:rPr>
+          <w:rFonts w:ascii="Arial" w:hAnsi="Arial" w:eastAsia="Arial" w:cs="Arial"/>
+          <w:b w:val="0"/>
+          <w:i w:val="0"/>
+          <w:color w:val="000000"/>
+          <w:sz w:val="18"/>
+          <w:highlight w:val="lightGray"/>
+        </w:rPr>
+        <w:t xml:space="preserve"> </w:t>
+      </w:r>
+      <w:r>
+        <w:rPr>
+          <w:rFonts w:ascii="Arial" w:hAnsi="Arial" w:eastAsia="Arial" w:cs="Arial"/>
+          <w:b w:val="0"/>
+          <w:i w:val="0"/>
+          <w:color w:val="000000"/>
+          <w:sz w:val="18"/>
+          <w:highlight w:val="lightGray"/>
+        </w:rPr>
+        <w:t>(</w:t>
+      </w:r>
+      <w:r>
+        <w:rPr>
+          <w:rFonts w:ascii="Arial" w:hAnsi="Arial" w:eastAsia="Arial" w:cs="Arial"/>
+          <w:b w:val="0"/>
+          <w:i w:val="0"/>
+          <w:color w:val="000000"/>
+          <w:sz w:val="18"/>
+          <w:highlight w:val="lightGray"/>
+        </w:rPr>
+        <w:t>G</w:t>
+      </w:r>
+      <w:r>
+        <w:rPr>
+          <w:rFonts w:ascii="Arial" w:hAnsi="Arial" w:eastAsia="Arial" w:cs="Arial"/>
+          <w:b w:val="0"/>
+          <w:i w:val="0"/>
+          <w:color w:val="000000"/>
+          <w:sz w:val="18"/>
+          <w:highlight w:val="lightGray"/>
+        </w:rPr>
+        <w:t>P</w:t>
+      </w:r>
+      <w:r>
+        <w:rPr>
+          <w:rFonts w:ascii="Arial" w:hAnsi="Arial" w:eastAsia="Arial" w:cs="Arial"/>
+          <w:b w:val="0"/>
+          <w:i w:val="0"/>
+          <w:color w:val="000000"/>
+          <w:sz w:val="18"/>
+          <w:highlight w:val="lightGray"/>
+        </w:rPr>
+        <w:t>T</w:t>
+      </w:r>
+      <w:r>
+        <w:rPr>
+          <w:rFonts w:ascii="Arial" w:hAnsi="Arial" w:eastAsia="Arial" w:cs="Arial"/>
+          <w:b w:val="0"/>
+          <w:i w:val="0"/>
+          <w:color w:val="000000"/>
+          <w:sz w:val="18"/>
+          <w:highlight w:val="lightGray"/>
         </w:rPr>
         <w:t>‑</w:t>
       </w:r>
       <w:r>
         <w:rPr>
-          <w:rFonts w:ascii="Arial" w:eastAsia="Arial" w:hAnsi="Arial"/>
-          <w:b/>
-          <w:sz w:val="22"/>
-          <w:szCs w:val="14"/>
-          <w:shd w:val="clear" w:color="auto" w:fill="B7B7B7"/>
-        </w:rPr>
-        <w:t>5 Mini) at [12/9/2025]</w:t>
+          <w:rFonts w:ascii="Arial" w:hAnsi="Arial" w:eastAsia="Arial" w:cs="Arial"/>
+          <w:b w:val="0"/>
+          <w:i w:val="0"/>
+          <w:color w:val="000000"/>
+          <w:sz w:val="18"/>
+          <w:highlight w:val="lightGray"/>
+        </w:rPr>
+        <w:t>5</w:t>
+      </w:r>
+      <w:r>
+        <w:rPr>
+          <w:rFonts w:ascii="Arial" w:hAnsi="Arial" w:eastAsia="Arial" w:cs="Arial"/>
+          <w:b w:val="0"/>
+          <w:i w:val="0"/>
+          <w:color w:val="000000"/>
+          <w:sz w:val="18"/>
+          <w:highlight w:val="lightGray"/>
+        </w:rPr>
+        <w:t xml:space="preserve"> </w:t>
+      </w:r>
+      <w:r>
+        <w:rPr>
+          <w:rFonts w:ascii="Arial" w:hAnsi="Arial" w:eastAsia="Arial" w:cs="Arial"/>
+          <w:b w:val="0"/>
+          <w:i w:val="0"/>
+          <w:color w:val="000000"/>
+          <w:sz w:val="18"/>
+          <w:highlight w:val="lightGray"/>
+        </w:rPr>
+        <w:t>M</w:t>
+      </w:r>
+      <w:r>
+        <w:rPr>
+          <w:rFonts w:ascii="Arial" w:hAnsi="Arial" w:eastAsia="Arial" w:cs="Arial"/>
+          <w:b w:val="0"/>
+          <w:i w:val="0"/>
+          <w:color w:val="000000"/>
+          <w:sz w:val="18"/>
+          <w:highlight w:val="lightGray"/>
+        </w:rPr>
+        <w:t>i</w:t>
+      </w:r>
+      <w:r>
+        <w:rPr>
+          <w:rFonts w:ascii="Arial" w:hAnsi="Arial" w:eastAsia="Arial" w:cs="Arial"/>
+          <w:b w:val="0"/>
+          <w:i w:val="0"/>
+          <w:color w:val="000000"/>
+          <w:sz w:val="18"/>
+          <w:highlight w:val="lightGray"/>
+        </w:rPr>
+        <w:t>n</w:t>
+      </w:r>
+      <w:r>
+        <w:rPr>
+          <w:rFonts w:ascii="Arial" w:hAnsi="Arial" w:eastAsia="Arial" w:cs="Arial"/>
+          <w:b w:val="0"/>
+          <w:i w:val="0"/>
+          <w:color w:val="000000"/>
+          <w:sz w:val="18"/>
+          <w:highlight w:val="lightGray"/>
+        </w:rPr>
+        <w:t>i</w:t>
+      </w:r>
+      <w:r>
+        <w:rPr>
+          <w:rFonts w:ascii="Arial" w:hAnsi="Arial" w:eastAsia="Arial" w:cs="Arial"/>
+          <w:b w:val="0"/>
+          <w:i w:val="0"/>
+          <w:color w:val="000000"/>
+          <w:sz w:val="18"/>
+          <w:highlight w:val="lightGray"/>
+        </w:rPr>
+        <w:t>)</w:t>
+      </w:r>
+      <w:r>
+        <w:rPr>
+          <w:rFonts w:ascii="Arial" w:hAnsi="Arial" w:eastAsia="Arial" w:cs="Arial"/>
+          <w:b w:val="0"/>
+          <w:i w:val="0"/>
+          <w:color w:val="000000"/>
+          <w:sz w:val="18"/>
+          <w:highlight w:val="lightGray"/>
+        </w:rPr>
+        <w:t>]</w:t>
+      </w:r>
+      <w:r>
+        <w:rPr>
+          <w:rFonts w:ascii="Arial" w:hAnsi="Arial" w:eastAsia="Arial" w:cs="Arial"/>
+          <w:b w:val="0"/>
+          <w:i w:val="0"/>
+          <w:color w:val="000000"/>
+          <w:sz w:val="18"/>
+          <w:highlight w:val="lightGray"/>
+        </w:rPr>
+        <w:t xml:space="preserve"> </w:t>
+      </w:r>
+      <w:r>
+        <w:rPr>
+          <w:rFonts w:ascii="Arial" w:hAnsi="Arial" w:eastAsia="Arial" w:cs="Arial"/>
+          <w:b/>
+          <w:i w:val="0"/>
+          <w:color w:val="000000"/>
+          <w:sz w:val="18"/>
+          <w:highlight w:val="lightGray"/>
+        </w:rPr>
+        <w:t>o</w:t>
+      </w:r>
+      <w:r>
+        <w:rPr>
+          <w:rFonts w:ascii="Arial" w:hAnsi="Arial" w:eastAsia="Arial" w:cs="Arial"/>
+          <w:b/>
+          <w:i w:val="0"/>
+          <w:color w:val="000000"/>
+          <w:sz w:val="18"/>
+          <w:highlight w:val="lightGray"/>
+        </w:rPr>
+        <w:t>n</w:t>
+      </w:r>
+      <w:r>
+        <w:rPr>
+          <w:rFonts w:ascii="Arial" w:hAnsi="Arial"/>
+          <w:b w:val="0"/>
+          <w:i w:val="0"/>
+          <w:color w:val="000000"/>
+          <w:sz w:val="18"/>
+          <w:highlight w:val="lightGray"/>
+        </w:rPr>
+        <w:t xml:space="preserve"> </w:t>
+      </w:r>
+      <w:r>
+        <w:rPr>
+          <w:rFonts w:ascii="Arial" w:hAnsi="Arial"/>
+          <w:b w:val="0"/>
+          <w:i w:val="0"/>
+          <w:color w:val="000000"/>
+          <w:sz w:val="18"/>
+          <w:highlight w:val="lightGray"/>
+        </w:rPr>
+        <w:t>[</w:t>
+      </w:r>
+      <w:r>
+        <w:rPr>
+          <w:rFonts w:ascii="Arial" w:hAnsi="Arial"/>
+          <w:b w:val="0"/>
+          <w:i w:val="0"/>
+          <w:sz w:val="18"/>
+          <w:highlight w:val="lightGray"/>
+        </w:rPr>
+        <w:t>12/9/2025]</w:t>
       </w:r>
     </w:p>
     <w:p>

</xml_diff>